<commit_message>
Upload Proyecto for version V0.0.0.w (063975b7-7477-40d1-b7fc-8c0737cee6f8)
</commit_message>
<xml_diff>
--- a/Proyecto/v0.0.0.w_pruebasSV/Matriz de Criterios de Evaluación Plataforma Analitica 2026.docx
+++ b/Proyecto/v0.0.0.w_pruebasSV/Matriz de Criterios de Evaluación Plataforma Analitica 2026.docx
@@ -39,6 +39,14 @@
           <w:szCs w:val="56"/>
         </w:rPr>
         <w:t xml:space="preserve">valuación </w:t>
+      </w:r>
+      <w:r>
+        <w:rPr>
+          <w:color w:val="EE0000"/>
+          <w:sz w:val="56"/>
+          <w:szCs w:val="56"/>
+        </w:rPr>
+        <w:t>xxx</w:t>
       </w:r>
       <w:r>
         <w:rPr>
@@ -7119,11 +7127,15 @@
       </w:pPr>
       <w:r>
         <w:rPr>
-          <w:rStyle w:val="s1"/>
           <w:noProof/>
         </w:rPr>
-        <w:pict w14:anchorId="52DDA872">
-          <v:rect id="_x0000_i1025" alt="" style="width:425.2pt;height:.05pt;mso-width-percent:0;mso-height-percent:0;mso-width-percent:0;mso-height-percent:0" o:hralign="center" o:hrstd="t" o:hr="t" fillcolor="#a0a0a0" stroked="f"/>
+      </w:r>
+      <w:r>
+        <w:pict w14:anchorId="73C58A81">
+          <v:rect id="Horizontal Line 1" o:spid="_x0000_s1026" style="width:700.2pt;height:.05pt;visibility:visible;mso-wrap-style:square;mso-left-percent:-10001;mso-top-percent:-10001;mso-position-horizontal:absolute;mso-position-horizontal-relative:char;mso-position-vertical:absolute;mso-position-vertical-relative:line;mso-left-percent:-10001;mso-top-percent:-10001;v-text-anchor:top" o:gfxdata="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" filled="f">
+            <o:lock v:ext="edit" rotation="t" aspectratio="t" verticies="t" text="t" shapetype="t"/>
+            <w10:anchorlock/>
+          </v:rect>
         </w:pict>
       </w:r>
     </w:p>
@@ -7200,6 +7212,9 @@
       <w:pStyle w:val="Encabezado"/>
     </w:pPr>
     <w:r>
+      <w:rPr>
+        <w:noProof/>
+      </w:rPr>
       <w:drawing>
         <wp:inline distT="0" distB="0" distL="0" distR="0" wp14:anchorId="1EA550E5" wp14:editId="6AE6F55C">
           <wp:extent cx="2920621" cy="745262"/>

</xml_diff>